<commit_message>
Update step crawl data
</commit_message>
<xml_diff>
--- a/ideas.docx
+++ b/ideas.docx
@@ -94,7 +94,25 @@
           <w:sz w:val="24"/>
           <w:szCs w:val="28"/>
         </w:rPr>
-        <w:t xml:space="preserve"> dự kiến như sau: text – type – human/ai.</w:t>
+        <w:t xml:space="preserve"> dự kiến như sau: text – type – human/ai</w:t>
+      </w:r>
+      <w:r>
+        <w:rPr>
+          <w:rFonts w:ascii="Times New Roman" w:hAnsi="Times New Roman"/>
+          <w:sz w:val="24"/>
+          <w:szCs w:val="28"/>
+        </w:rPr>
+        <w:t xml:space="preserve"> (Dự kiến)</w:t>
+      </w:r>
+      <w:bookmarkStart w:id="0" w:name="_GoBack"/>
+      <w:bookmarkEnd w:id="0"/>
+      <w:r>
+        <w:rPr>
+          <w:rFonts w:ascii="Times New Roman" w:hAnsi="Times New Roman"/>
+          <w:sz w:val="24"/>
+          <w:szCs w:val="28"/>
+        </w:rPr>
+        <w:t>.</w:t>
       </w:r>
     </w:p>
     <w:p>
@@ -121,7 +139,23 @@
           <w:sz w:val="24"/>
           <w:szCs w:val="28"/>
         </w:rPr>
-        <w:t xml:space="preserve"> Khi crawl dữ liệu xong, đưa dữ liệu đó sang AI để generate ra content AI.</w:t>
+        <w:t xml:space="preserve"> Khi crawl dữ liệu xong, đưa dữ liệu đó sang AI để generate ra content AI</w:t>
+      </w:r>
+      <w:r>
+        <w:rPr>
+          <w:rFonts w:ascii="Times New Roman" w:hAnsi="Times New Roman"/>
+          <w:sz w:val="24"/>
+          <w:szCs w:val="28"/>
+        </w:rPr>
+        <w:t xml:space="preserve"> (Dự kiến)</w:t>
+      </w:r>
+      <w:r>
+        <w:rPr>
+          <w:rFonts w:ascii="Times New Roman" w:hAnsi="Times New Roman"/>
+          <w:sz w:val="24"/>
+          <w:szCs w:val="28"/>
+        </w:rPr>
+        <w:t>.</w:t>
       </w:r>
     </w:p>
     <w:p>
@@ -313,8 +347,6 @@
           <w:szCs w:val="28"/>
         </w:rPr>
       </w:pPr>
-      <w:bookmarkStart w:id="0" w:name="_GoBack"/>
-      <w:bookmarkEnd w:id="0"/>
     </w:p>
     <w:sectPr>
       <w:pgSz w:w="12240" w:h="15840"/>

</xml_diff>